<commit_message>
feat: readiness pre-lessons for all 74 lessons (HTML + DOCX)
- Data-driven pipeline: scripts/readiness/data/<id>.json drives both formats
- generate-readiness-html.mjs + generate-readiness-docx.mjs (shared style.css)
- 74 lessons across 10 units: diagnostic auto-routing to L0/L1/L2,
  tiered prerequisite practice, hand-off into the lesson, printable packet + answer key
- config.readiness=true on every lesson (renderer banner surfaces the on-ramp)
- QA: 0 structural errors, adversarial math verifier found 0 wrong answers,
  browser-verified routing+grading on 1-2 and 9-2
</commit_message>
<xml_diff>
--- a/lessons/1-2/readiness/practice.docx
+++ b/lessons/1-2/readiness/practice.docx
@@ -68,7 +68,7 @@
           <w:sz w:val="22"/>
           <w:szCs w:val="22"/>
         </w:rPr>
-        <w:t xml:space="preserve">To find the greatest common factor of two numbers you first list each number's factors quickly — which runs on multiplication facts and divisibility. Warm these up and GCF feels easy.</w:t>
+        <w:t xml:space="preserve">To find the greatest common factor of two numbers, you first have to list each number's factors quickly — and that runs on multiplication facts and knowing what divides evenly. Get these warm and GCF feels easy.</w:t>
       </w:r>
     </w:p>
     <w:p>
@@ -124,7 +124,7 @@
           <w:sz w:val="20"/>
           <w:szCs w:val="20"/>
         </w:rPr>
-        <w:t xml:space="preserve">List factors one step at a time.</w:t>
+        <w:t xml:space="preserve">Let's list factors one step at a time.</w:t>
       </w:r>
     </w:p>
     <w:p>
@@ -136,7 +136,7 @@
           <w:sz w:val="22"/>
           <w:szCs w:val="22"/>
         </w:rPr>
-        <w:t xml:space="preserve">1.  Fill the missing partner:  1 × ____ = 6</w:t>
+        <w:t xml:space="preserve">1.  Fill the missing partner: 1 × ___ = 6</w:t>
       </w:r>
     </w:p>
     <w:p>
@@ -159,7 +159,7 @@
           <w:sz w:val="22"/>
           <w:szCs w:val="22"/>
         </w:rPr>
-        <w:t xml:space="preserve">2.  Fill the missing partner:  2 × ____ = 6</w:t>
+        <w:t xml:space="preserve">2.  Fill the missing partner: 2 × ___ = 6</w:t>
       </w:r>
     </w:p>
     <w:p>
@@ -182,53 +182,7 @@
           <w:sz w:val="22"/>
           <w:szCs w:val="22"/>
         </w:rPr>
-        <w:t xml:space="preserve">3.  So the factors of 6 are 1, 2, 3, and ____</w:t>
-      </w:r>
-    </w:p>
-    <w:p>
-      <w:pPr>
-        <w:spacing w:after="80" w:before="0"/>
-      </w:pPr>
-      <w:r>
-        <w:rPr>
-          <w:color w:val="BBBBBB"/>
-        </w:rPr>
-        <w:t xml:space="preserve">____________________________________________________</w:t>
-      </w:r>
-    </w:p>
-    <w:p>
-      <w:pPr>
-        <w:spacing w:after="40" w:before="0"/>
-      </w:pPr>
-      <w:r>
-        <w:rPr>
-          <w:sz w:val="22"/>
-          <w:szCs w:val="22"/>
-        </w:rPr>
-        <w:t xml:space="preserve">4.  Fill the missing partner:  1 × ____ = 8</w:t>
-      </w:r>
-    </w:p>
-    <w:p>
-      <w:pPr>
-        <w:spacing w:after="80" w:before="0"/>
-      </w:pPr>
-      <w:r>
-        <w:rPr>
-          <w:color w:val="BBBBBB"/>
-        </w:rPr>
-        <w:t xml:space="preserve">____________________________________________________</w:t>
-      </w:r>
-    </w:p>
-    <w:p>
-      <w:pPr>
-        <w:spacing w:after="40" w:before="0"/>
-      </w:pPr>
-      <w:r>
-        <w:rPr>
-          <w:sz w:val="22"/>
-          <w:szCs w:val="22"/>
-        </w:rPr>
-        <w:t xml:space="preserve">5.  Fill the missing partner:  2 × ____ = 8</w:t>
+        <w:t xml:space="preserve">3.  So the factors of 6 are 1, 2, 3, and ___?</w:t>
       </w:r>
     </w:p>
     <w:p>
@@ -280,7 +234,7 @@
           <w:sz w:val="22"/>
           <w:szCs w:val="22"/>
         </w:rPr>
-        <w:t xml:space="preserve">1.  List ALL the factors of 8.</w:t>
+        <w:t xml:space="preserve">1.  How many factors does 8 have? (1, 2, 4, 8)</w:t>
       </w:r>
     </w:p>
     <w:p>
@@ -303,18 +257,7 @@
           <w:sz w:val="22"/>
           <w:szCs w:val="22"/>
         </w:rPr>
-        <w:t xml:space="preserve">2.  List ALL the factors of 12.</w:t>
-      </w:r>
-    </w:p>
-    <w:p>
-      <w:pPr>
-        <w:spacing w:after="80" w:before="0"/>
-      </w:pPr>
-      <w:r>
-        <w:rPr>
-          <w:color w:val="BBBBBB"/>
-        </w:rPr>
-        <w:t xml:space="preserve">____________________________________________________</w:t>
+        <w:t xml:space="preserve">2.  Which number is a common factor of 8 and 12?</w:t>
       </w:r>
     </w:p>
     <w:p>
@@ -323,33 +266,11 @@
       </w:pPr>
       <w:r>
         <w:rPr>
-          <w:sz w:val="22"/>
-          <w:szCs w:val="22"/>
-        </w:rPr>
-        <w:t xml:space="preserve">3.  Circle the factors 8 and 12 SHARE (common factors).</w:t>
-      </w:r>
-    </w:p>
-    <w:p>
-      <w:pPr>
-        <w:spacing w:after="80" w:before="0"/>
-      </w:pPr>
-      <w:r>
-        <w:rPr>
-          <w:color w:val="BBBBBB"/>
-        </w:rPr>
-        <w:t xml:space="preserve">____________________________________________________</w:t>
-      </w:r>
-    </w:p>
-    <w:p>
-      <w:pPr>
-        <w:spacing w:after="40" w:before="0"/>
-      </w:pPr>
-      <w:r>
-        <w:rPr>
-          <w:sz w:val="22"/>
-          <w:szCs w:val="22"/>
-        </w:rPr>
-        <w:t xml:space="preserve">4.  Which is a common factor of 8 and 12: 3, 4, or 8?</w:t>
+          <w:color w:val="5E6E7E"/>
+          <w:sz w:val="20"/>
+          <w:szCs w:val="20"/>
+        </w:rPr>
+        <w:t xml:space="preserve">     choices: 3   /   4   /   8   /   12</w:t>
       </w:r>
     </w:p>
     <w:p>
@@ -389,7 +310,7 @@
           <w:sz w:val="20"/>
           <w:szCs w:val="20"/>
         </w:rPr>
-        <w:t xml:space="preserve">Warm up straight into GCF.</w:t>
+        <w:t xml:space="preserve">Warm-up straight into GCF.</w:t>
       </w:r>
     </w:p>
     <w:p>
@@ -401,7 +322,7 @@
           <w:sz w:val="22"/>
           <w:szCs w:val="22"/>
         </w:rPr>
-        <w:t xml:space="preserve">1.  Factors of 18 and 24 — what is the GREATEST factor they share?</w:t>
+        <w:t xml:space="preserve">1.  Factors of 18 and 24 — what is the greatest factor they share?</w:t>
       </w:r>
     </w:p>
     <w:p>
@@ -424,53 +345,7 @@
           <w:sz w:val="22"/>
           <w:szCs w:val="22"/>
         </w:rPr>
-        <w:t xml:space="preserve">2.  GCF of 9 and 15 = ?</w:t>
-      </w:r>
-    </w:p>
-    <w:p>
-      <w:pPr>
-        <w:spacing w:after="80" w:before="0"/>
-      </w:pPr>
-      <w:r>
-        <w:rPr>
-          <w:color w:val="BBBBBB"/>
-        </w:rPr>
-        <w:t xml:space="preserve">____________________________________________________</w:t>
-      </w:r>
-    </w:p>
-    <w:p>
-      <w:pPr>
-        <w:spacing w:after="40" w:before="0"/>
-      </w:pPr>
-      <w:r>
-        <w:rPr>
-          <w:sz w:val="22"/>
-          <w:szCs w:val="22"/>
-        </w:rPr>
-        <w:t xml:space="preserve">3.  GCF of 16 and 24 = ?</w:t>
-      </w:r>
-    </w:p>
-    <w:p>
-      <w:pPr>
-        <w:spacing w:after="80" w:before="0"/>
-      </w:pPr>
-      <w:r>
-        <w:rPr>
-          <w:color w:val="BBBBBB"/>
-        </w:rPr>
-        <w:t xml:space="preserve">____________________________________________________</w:t>
-      </w:r>
-    </w:p>
-    <w:p>
-      <w:pPr>
-        <w:spacing w:after="40" w:before="0"/>
-      </w:pPr>
-      <w:r>
-        <w:rPr>
-          <w:sz w:val="22"/>
-          <w:szCs w:val="22"/>
-        </w:rPr>
-        <w:t xml:space="preserve">4.  GCF of 7 and 21 = ?</w:t>
+        <w:t xml:space="preserve">2.  What is the GCF of 9 and 15?</w:t>
       </w:r>
     </w:p>
     <w:p>
@@ -508,7 +383,20 @@
           <w:sz w:val="22"/>
           <w:szCs w:val="22"/>
         </w:rPr>
-        <w:t xml:space="preserve">1.  Name a factor of 10 that is greater than 1 and less than 10.</w:t>
+        <w:t xml:space="preserve">1.  List a factor of 10 that is greater than 1 and less than 10.</w:t>
+      </w:r>
+    </w:p>
+    <w:p>
+      <w:pPr>
+        <w:spacing w:after="40" w:before="0"/>
+      </w:pPr>
+      <w:r>
+        <w:rPr>
+          <w:color w:val="5E6E7E"/>
+          <w:sz w:val="20"/>
+          <w:szCs w:val="20"/>
+        </w:rPr>
+        <w:t xml:space="preserve">     choices: 3   /   5   /   4   /   7</w:t>
       </w:r>
     </w:p>
     <w:p>
@@ -531,7 +419,7 @@
           <w:sz w:val="22"/>
           <w:szCs w:val="22"/>
         </w:rPr>
-        <w:t xml:space="preserve">2.  Greatest common factor of 6 and 9 = ?</w:t>
+        <w:t xml:space="preserve">2.  What is the greatest common factor of 6 and 9?</w:t>
       </w:r>
     </w:p>
     <w:p>
@@ -557,7 +445,7 @@
           <w:sz w:val="20"/>
           <w:szCs w:val="20"/>
         </w:rPr>
-        <w:t xml:space="preserve">When you've finished, open Lesson 1-2 and find the Greatest Common Factor!</w:t>
+        <w:t xml:space="preserve">When you've finished, open Lesson 1-2 and dive in!</w:t>
       </w:r>
     </w:p>
     <w:p>
@@ -633,6 +521,21 @@
     </w:p>
     <w:p>
       <w:pPr>
+        <w:spacing w:after="40" w:before="100"/>
+      </w:pPr>
+      <w:r>
+        <w:rPr>
+          <w:b/>
+          <w:bCs/>
+          <w:color w:val="1A6FB5"/>
+          <w:sz w:val="22"/>
+          <w:szCs w:val="22"/>
+        </w:rPr>
+        <w:t xml:space="preserve">Level 1 · Support</w:t>
+      </w:r>
+    </w:p>
+    <w:p>
+      <w:pPr>
         <w:spacing w:after="30" w:before="0"/>
       </w:pPr>
       <w:r>
@@ -640,7 +543,7 @@
           <w:sz w:val="20"/>
           <w:szCs w:val="20"/>
         </w:rPr>
-        <w:t xml:space="preserve">4. 8</w:t>
+        <w:t xml:space="preserve">1. 4</w:t>
       </w:r>
     </w:p>
     <w:p>
@@ -652,7 +555,7 @@
           <w:sz w:val="20"/>
           <w:szCs w:val="20"/>
         </w:rPr>
-        <w:t xml:space="preserve">5. 4</w:t>
+        <w:t xml:space="preserve">2. 4</w:t>
       </w:r>
     </w:p>
     <w:p>
@@ -667,7 +570,7 @@
           <w:sz w:val="22"/>
           <w:szCs w:val="22"/>
         </w:rPr>
-        <w:t xml:space="preserve">Level 1 · Support</w:t>
+        <w:t xml:space="preserve">Level 2 · Stretch</w:t>
       </w:r>
     </w:p>
     <w:p>
@@ -679,7 +582,7 @@
           <w:sz w:val="20"/>
           <w:szCs w:val="20"/>
         </w:rPr>
-        <w:t xml:space="preserve">1. 1, 2, 4, 8</w:t>
+        <w:t xml:space="preserve">1. 6</w:t>
       </w:r>
     </w:p>
     <w:p>
@@ -691,7 +594,22 @@
           <w:sz w:val="20"/>
           <w:szCs w:val="20"/>
         </w:rPr>
-        <w:t xml:space="preserve">2. 1, 2, 3, 4, 6, 12</w:t>
+        <w:t xml:space="preserve">2. 3</w:t>
+      </w:r>
+    </w:p>
+    <w:p>
+      <w:pPr>
+        <w:spacing w:after="40" w:before="100"/>
+      </w:pPr>
+      <w:r>
+        <w:rPr>
+          <w:b/>
+          <w:bCs/>
+          <w:color w:val="C45A3C"/>
+          <w:sz w:val="22"/>
+          <w:szCs w:val="22"/>
+        </w:rPr>
+        <w:t xml:space="preserve">Exit Ticket</w:t>
       </w:r>
     </w:p>
     <w:p>
@@ -703,109 +621,7 @@
           <w:sz w:val="20"/>
           <w:szCs w:val="20"/>
         </w:rPr>
-        <w:t xml:space="preserve">3. 1, 2, 4</w:t>
-      </w:r>
-    </w:p>
-    <w:p>
-      <w:pPr>
-        <w:spacing w:after="30" w:before="0"/>
-      </w:pPr>
-      <w:r>
-        <w:rPr>
-          <w:sz w:val="20"/>
-          <w:szCs w:val="20"/>
-        </w:rPr>
-        <w:t xml:space="preserve">4. 4</w:t>
-      </w:r>
-    </w:p>
-    <w:p>
-      <w:pPr>
-        <w:spacing w:after="40" w:before="100"/>
-      </w:pPr>
-      <w:r>
-        <w:rPr>
-          <w:b/>
-          <w:bCs/>
-          <w:color w:val="1A6FB5"/>
-          <w:sz w:val="22"/>
-          <w:szCs w:val="22"/>
-        </w:rPr>
-        <w:t xml:space="preserve">Level 2 · Stretch</w:t>
-      </w:r>
-    </w:p>
-    <w:p>
-      <w:pPr>
-        <w:spacing w:after="30" w:before="0"/>
-      </w:pPr>
-      <w:r>
-        <w:rPr>
-          <w:sz w:val="20"/>
-          <w:szCs w:val="20"/>
-        </w:rPr>
-        <w:t xml:space="preserve">1. 6</w:t>
-      </w:r>
-    </w:p>
-    <w:p>
-      <w:pPr>
-        <w:spacing w:after="30" w:before="0"/>
-      </w:pPr>
-      <w:r>
-        <w:rPr>
-          <w:sz w:val="20"/>
-          <w:szCs w:val="20"/>
-        </w:rPr>
-        <w:t xml:space="preserve">2. 3</w:t>
-      </w:r>
-    </w:p>
-    <w:p>
-      <w:pPr>
-        <w:spacing w:after="30" w:before="0"/>
-      </w:pPr>
-      <w:r>
-        <w:rPr>
-          <w:sz w:val="20"/>
-          <w:szCs w:val="20"/>
-        </w:rPr>
-        <w:t xml:space="preserve">3. 8</w:t>
-      </w:r>
-    </w:p>
-    <w:p>
-      <w:pPr>
-        <w:spacing w:after="30" w:before="0"/>
-      </w:pPr>
-      <w:r>
-        <w:rPr>
-          <w:sz w:val="20"/>
-          <w:szCs w:val="20"/>
-        </w:rPr>
-        <w:t xml:space="preserve">4. 7</w:t>
-      </w:r>
-    </w:p>
-    <w:p>
-      <w:pPr>
-        <w:spacing w:after="40" w:before="100"/>
-      </w:pPr>
-      <w:r>
-        <w:rPr>
-          <w:b/>
-          <w:bCs/>
-          <w:color w:val="C45A3C"/>
-          <w:sz w:val="22"/>
-          <w:szCs w:val="22"/>
-        </w:rPr>
-        <w:t xml:space="preserve">Exit Ticket</w:t>
-      </w:r>
-    </w:p>
-    <w:p>
-      <w:pPr>
-        <w:spacing w:after="30" w:before="0"/>
-      </w:pPr>
-      <w:r>
-        <w:rPr>
-          <w:sz w:val="20"/>
-          <w:szCs w:val="20"/>
-        </w:rPr>
-        <w:t xml:space="preserve">1. 2 or 5</w:t>
+        <w:t xml:space="preserve">1. 5</w:t>
       </w:r>
     </w:p>
     <w:p>

</xml_diff>